<commit_message>
Resume: Information Security Risk Analyst @ Columbia Sportswear Company (MNC)
</commit_message>
<xml_diff>
--- a/resumes/Resume_Information_Security_Risk_Analyst_Columbia_Sportswear_Company__MNC_.docx
+++ b/resumes/Resume_Information_Security_Risk_Analyst_Columbia_Sportswear_Company__MNC_.docx
@@ -413,7 +413,7 @@
           <w:sz w:val="19"/>
           <w:szCs w:val="19"/>
         </w:rPr>
-        <w:t>Triaged 50+ weekly inventory reimbursement cases by severity and policy eligibility, following structured workflows and escalating findings to senior reviewers for risk analysis.</w:t>
+        <w:t>Triaged 50+ weekly inventory reimbursement cases by severity and policy eligibility, following structured case triage and escalation workflows to identify risk and security gaps.</w:t>
       </w:r>
     </w:p>
     <w:p>
@@ -432,7 +432,7 @@
           <w:sz w:val="19"/>
           <w:szCs w:val="19"/>
         </w:rPr>
-        <w:t>Analyzed seller claims, identified policy violations and anomalous patterns, and escalated findings to senior reviewers for security compliance.</w:t>
+        <w:t>Analyzed seller claims, identified policy violations and anomalous patterns, and escalated findings to senior reviewers for security and compliance review.</w:t>
       </w:r>
     </w:p>
     <w:p>
@@ -451,7 +451,7 @@
           <w:sz w:val="19"/>
           <w:szCs w:val="19"/>
         </w:rPr>
-        <w:t>Maintained audit-ready case documentation recording investigation findings, decisions, evidence notes, and corrective actions for information security.</w:t>
+        <w:t>Maintained audit-ready case documentation recording investigation findings, decisions, evidence notes, and corrective actions to ensure information security and risk management.</w:t>
       </w:r>
     </w:p>
     <w:p>
@@ -470,7 +470,7 @@
           <w:sz w:val="19"/>
           <w:szCs w:val="19"/>
         </w:rPr>
-        <w:t>Spotted recurring fraud patterns across 200+ weekly cases and flagged them early, reducing repeat-issue investigation time before escalation for vulnerability scanning.</w:t>
+        <w:t>Spotted recurring fraud patterns across 200+ weekly cases and flagged them early, reducing repeat-issue investigation time before escalation to prevent security breaches.</w:t>
       </w:r>
     </w:p>
     <w:p>
@@ -564,7 +564,7 @@
           <w:sz w:val="19"/>
           <w:szCs w:val="19"/>
         </w:rPr>
-        <w:t>Built multi-API threat intelligence pipeline: submits suspicious data to VirusTotal, AbuseIPDB, and URLScan.io; cross-references WHOIS, DNS, and SSL details to produce a unified phishing probability score (EPSS: 80).</w:t>
+        <w:t>Built multi-API threat intelligence pipeline: submits suspicious data to VirusTotal, AbuseIPDB, and URLScan.io; cross-references WHOIS, DNS, and SSL details for unified phishing probability score.</w:t>
       </w:r>
     </w:p>
     <w:p>
@@ -583,7 +583,7 @@
           <w:sz w:val="19"/>
           <w:szCs w:val="19"/>
         </w:rPr>
-        <w:t>Developed typosquatting detector generating domain variants and checking live DNS resolution to catch brand-impersonation attacks early.</w:t>
+        <w:t>Implemented typosquatting detector generating domain variants and checking live DNS resolution to catch brand-impersonation attacks.</w:t>
       </w:r>
     </w:p>
     <w:p>
@@ -602,7 +602,7 @@
           <w:sz w:val="19"/>
           <w:szCs w:val="19"/>
         </w:rPr>
-        <w:t>Deployed Telegram bot interface for live IOC enrichment, supporting bulk CSV input/output and OSINT enrichment via theHarvester for domain profiling.</w:t>
+        <w:t>Developed Telegram bot interface for live IOC enrichment, supporting bulk CSV input/output and OSINT enrichment via theHarvester for domain profiling.</w:t>
       </w:r>
     </w:p>
     <w:p>
@@ -672,7 +672,7 @@
           <w:sz w:val="19"/>
           <w:szCs w:val="19"/>
         </w:rPr>
-        <w:t>Developed automated vulnerability assessment pipeline integrating Nessus and OpenVAS REST APIs in Python, generating CVE reports with CVSS severity and EPSS scoring from FIRST.org API.</w:t>
+        <w:t>Developed automated vulnerability assessment pipeline in Python integrating Nessus and OpenVAS REST APIs, generating CVE reports with CVSS severity and EPSS scoring from FIRST.org API.</w:t>
       </w:r>
     </w:p>
     <w:p>
@@ -691,7 +691,7 @@
           <w:sz w:val="19"/>
           <w:szCs w:val="19"/>
         </w:rPr>
-        <w:t>Developed OWASP Top 10 automated web checker detecting injection, auth, and SSRF vulnerabilities; documented SQL injection exploit and remediation.</w:t>
+        <w:t>Developed OWASP Top 10 automated web checker to detect injection, auth, and SSRF vulnerabilities, documenting SQL injection exploit and remediation.</w:t>
       </w:r>
     </w:p>
     <w:p>
@@ -710,7 +710,7 @@
           <w:sz w:val="19"/>
           <w:szCs w:val="19"/>
         </w:rPr>
-        <w:t>Automated scan scheduling via Bash and cron; built delta-scan logic for CVE flagging and remediation SLA deadlines (Critical=24hrs, High=7 days, Medium=30 days).</w:t>
+        <w:t>Automated scan scheduling via Bash and cron; built delta-scan logic to flag new CVEs, calculate remediation SLA deadlines (Critical=24hrs, High=7 days, Medium=30 days).</w:t>
       </w:r>
     </w:p>
     <w:p>

</xml_diff>